<commit_message>
Updated grants and new and upcoming
</commit_message>
<xml_diff>
--- a/docx/Alamenciak_CV.docx
+++ b/docx/Alamenciak_CV.docx
@@ -50,7 +50,7 @@
       <w:pPr>
         <w:spacing w:after="40" w:before="0"/>
       </w:pPr>
-      <w:hyperlink w:history="1" r:id="rIdjoo-cuneigtlg4urouhri">
+      <w:hyperlink w:history="1" r:id="rIdcersbmczms5ksz7ii1nl4">
         <w:r>
           <w:rPr>
             <w:rFonts w:ascii="Arial" w:cs="Arial" w:eastAsia="Arial" w:hAnsi="Arial"/>
@@ -70,7 +70,7 @@
         </w:rPr>
         <w:t xml:space="preserve">  |  </w:t>
       </w:r>
-      <w:hyperlink w:history="1" r:id="rIdwvz95tp-bv8mennelhxta">
+      <w:hyperlink w:history="1" r:id="rIdyfym5umuhbgqkzddk5yij">
         <w:r>
           <w:rPr>
             <w:rFonts w:ascii="Arial" w:cs="Arial" w:eastAsia="Arial" w:hAnsi="Arial"/>
@@ -246,7 +246,7 @@
               </w:rPr>
               <w:t xml:space="preserve">. </w:t>
             </w:r>
-            <w:hyperlink w:history="1" r:id="rIdlqvazr1jugdyaawdrl8_e">
+            <w:hyperlink w:history="1" r:id="rIdjcmricl7kfpjgcdfjg-45">
               <w:r>
                 <w:rPr>
                   <w:rFonts w:ascii="Arial" w:cs="Arial" w:eastAsia="Arial" w:hAnsi="Arial"/>
@@ -392,7 +392,7 @@
               </w:rPr>
               <w:t xml:space="preserve">. </w:t>
             </w:r>
-            <w:hyperlink w:history="1" r:id="rIdrgydzdnk3b163lseymihn">
+            <w:hyperlink w:history="1" r:id="rIdicxkbw94autcfhgjmumel">
               <w:r>
                 <w:rPr>
                   <w:rFonts w:ascii="Arial" w:cs="Arial" w:eastAsia="Arial" w:hAnsi="Arial"/>
@@ -490,7 +490,7 @@
                 <w:sz w:val="20"/>
                 <w:szCs w:val="20"/>
               </w:rPr>
-              <w:t xml:space="preserve">Identifying practitioner and researcher collaboration needs to improve ecosystem restoration in Canada</w:t>
+              <w:t xml:space="preserve">Which Aspects of Restoration Project Organization Affect Volunteer Engagement in Community-Based Initiatives?</w:t>
             </w:r>
           </w:p>
           <w:p>
@@ -513,7 +513,7 @@
                 <w:sz w:val="20"/>
                 <w:szCs w:val="20"/>
               </w:rPr>
-              <w:t xml:space="preserve">, Nancy Shackelford, Logan Rehberg, Ash Baron, Steven D. Murphy, Eric Higgs, Tina Heger, Alina Fisher, Bruno Travassos-Britto, Ryan Stephenson</w:t>
+              <w:t xml:space="preserve">, Stephen D. Murphy</w:t>
             </w:r>
           </w:p>
           <w:p>
@@ -528,28 +528,8 @@
                 <w:sz w:val="20"/>
                 <w:szCs w:val="20"/>
               </w:rPr>
-              <w:t xml:space="preserve">Socio-Ecological Practice Research</w:t>
-            </w:r>
-            <w:r>
-              <w:rPr>
-                <w:rFonts w:ascii="Arial" w:cs="Arial" w:eastAsia="Arial" w:hAnsi="Arial"/>
-                <w:sz w:val="20"/>
-                <w:szCs w:val="20"/>
-              </w:rPr>
-              <w:t xml:space="preserve">. </w:t>
-            </w:r>
-            <w:hyperlink w:history="1" r:id="rId4-7pvccihgkdag_ksblda">
-              <w:r>
-                <w:rPr>
-                  <w:rFonts w:ascii="Arial" w:cs="Arial" w:eastAsia="Arial" w:hAnsi="Arial"/>
-                  <w:color w:val="2980B9"/>
-                  <w:sz w:val="20"/>
-                  <w:szCs w:val="20"/>
-                  <w:u w:val="single"/>
-                </w:rPr>
-                <w:t xml:space="preserve">Link</w:t>
-              </w:r>
-            </w:hyperlink>
+              <w:t xml:space="preserve">Restoration Ecology</w:t>
+            </w:r>
           </w:p>
         </w:tc>
       </w:tr>
@@ -636,7 +616,7 @@
                 <w:sz w:val="20"/>
                 <w:szCs w:val="20"/>
               </w:rPr>
-              <w:t xml:space="preserve">Supporting frontline workers in the biodiversity crisis by empowering and enabling practitioners to embrace conservation evidence</w:t>
+              <w:t xml:space="preserve">Identifying practitioner and researcher collaboration needs to improve ecosystem restoration in Canada</w:t>
             </w:r>
           </w:p>
           <w:p>
@@ -646,14 +626,6 @@
             <w:r>
               <w:rPr>
                 <w:rFonts w:ascii="Arial" w:cs="Arial" w:eastAsia="Arial" w:hAnsi="Arial"/>
-                <w:sz w:val="20"/>
-                <w:szCs w:val="20"/>
-              </w:rPr>
-              <w:t xml:space="preserve">Steven J. Cooke, Kevin A. Adeli, Trina Rytwinski, Andrew N. Kadykalo, Jennifer Provencher, Vivian Nguyen, Joseph Bennett, Christina Davy, Rachel Buxton, Dalal Hanna, Jesse C. Vermaire, Sean Landsman, Nathan Young, Graeme Auld, Danika Littlechild, Jennifer M. Holzer, Meagan Harper, Andrew Howarth, </w:t>
-            </w:r>
-            <w:r>
-              <w:rPr>
-                <w:rFonts w:ascii="Arial" w:cs="Arial" w:eastAsia="Arial" w:hAnsi="Arial"/>
                 <w:b/>
                 <w:bCs/>
                 <w:sz w:val="20"/>
@@ -667,7 +639,7 @@
                 <w:sz w:val="20"/>
                 <w:szCs w:val="20"/>
               </w:rPr>
-              <w:t xml:space="preserve">, Lauren Lawson, Jayme Lewthwaite, Erin E. Stukenholtz, Paul A. Smith, Ilona Naujokaitis-Lewis, Josie Hughes, Barbara Frei, Amanda Martin, Amie Black, Richard Pither, Douglas MacNearney, Kristen Lalla, Carmen Galan-Acedo and Christopher Cvitanovic</w:t>
+              <w:t xml:space="preserve">, Nancy Shackelford, Logan Rehberg, Ash Baron, Steven D. Murphy, Eric Higgs, Tina Heger, Alina Fisher, Bruno Travassos-Britto, Ryan Stephenson</w:t>
             </w:r>
           </w:p>
           <w:p>
@@ -692,7 +664,7 @@
               </w:rPr>
               <w:t xml:space="preserve">. </w:t>
             </w:r>
-            <w:hyperlink w:history="1" r:id="rIdxutr9ypslzp8lzd3s4u3g">
+            <w:hyperlink w:history="1" r:id="rIduhlprljytab6q-luhtspm">
               <w:r>
                 <w:rPr>
                   <w:rFonts w:ascii="Arial" w:cs="Arial" w:eastAsia="Arial" w:hAnsi="Arial"/>
@@ -758,7 +730,7 @@
                 <w:sz w:val="20"/>
                 <w:szCs w:val="20"/>
               </w:rPr>
-              <w:t xml:space="preserve">[5] 2025</w:t>
+              <w:t xml:space="preserve">[5] 2026</w:t>
             </w:r>
           </w:p>
         </w:tc>
@@ -790,7 +762,7 @@
                 <w:sz w:val="20"/>
                 <w:szCs w:val="20"/>
               </w:rPr>
-              <w:t xml:space="preserve">Increasing the credibility of conservation plans through citizen science</w:t>
+              <w:t xml:space="preserve">Supporting frontline workers in the biodiversity crisis by empowering and enabling practitioners to embrace conservation evidence</w:t>
             </w:r>
           </w:p>
           <w:p>
@@ -803,7 +775,7 @@
                 <w:sz w:val="20"/>
                 <w:szCs w:val="20"/>
               </w:rPr>
-              <w:t xml:space="preserve">Jeffrey O. Hanson, Jenny L. McCune, </w:t>
+              <w:t xml:space="preserve">Steven J. Cooke, Kevin A. Adeli, Trina Rytwinski, Andrew N. Kadykalo, Jennifer Provencher, Vivian Nguyen, Joseph Bennett, Christina Davy, Rachel Buxton, Dalal Hanna, Jesse C. Vermaire, Sean Landsman, Nathan Young, Graeme Auld, Danika Littlechild, Jennifer M. Holzer, Meagan Harper, Andrew Howarth, </w:t>
             </w:r>
             <w:r>
               <w:rPr>
@@ -821,7 +793,7 @@
                 <w:sz w:val="20"/>
                 <w:szCs w:val="20"/>
               </w:rPr>
-              <w:t xml:space="preserve">, Joseph R. Bennett</w:t>
+              <w:t xml:space="preserve">, Lauren Lawson, Jayme Lewthwaite, Erin E. Stukenholtz, Paul A. Smith, Ilona Naujokaitis-Lewis, Josie Hughes, Barbara Frei, Amanda Martin, Amie Black, Richard Pither, Douglas MacNearney, Kristen Lalla, Carmen Galan-Acedo and Christopher Cvitanovic</w:t>
             </w:r>
           </w:p>
           <w:p>
@@ -836,7 +808,7 @@
                 <w:sz w:val="20"/>
                 <w:szCs w:val="20"/>
               </w:rPr>
-              <w:t xml:space="preserve">Biological Conservation</w:t>
+              <w:t xml:space="preserve">Socio-Ecological Practice Research</w:t>
             </w:r>
             <w:r>
               <w:rPr>
@@ -846,7 +818,7 @@
               </w:rPr>
               <w:t xml:space="preserve">. </w:t>
             </w:r>
-            <w:hyperlink w:history="1" r:id="rIdama2jsnrcinbkkmnj5e-m">
+            <w:hyperlink w:history="1" r:id="rId1nyyghffijftcyavn6jwg">
               <w:r>
                 <w:rPr>
                   <w:rFonts w:ascii="Arial" w:cs="Arial" w:eastAsia="Arial" w:hAnsi="Arial"/>
@@ -944,7 +916,7 @@
                 <w:sz w:val="20"/>
                 <w:szCs w:val="20"/>
               </w:rPr>
-              <w:t xml:space="preserve">Parallels between biological invasions and human migration are flawed and undermine both disciplines. Response to Ahmed et al</w:t>
+              <w:t xml:space="preserve">Increasing the credibility of conservation plans through citizen science</w:t>
             </w:r>
           </w:p>
           <w:p>
@@ -957,7 +929,7 @@
                 <w:sz w:val="20"/>
                 <w:szCs w:val="20"/>
               </w:rPr>
-              <w:t xml:space="preserve">Josie South, Roxana Barbulescu, Rafael L. Macedo, Camille L. Musseau, Simone Guareschi, </w:t>
+              <w:t xml:space="preserve">Jeffrey O. Hanson, Jenny L. McCune, </w:t>
             </w:r>
             <w:r>
               <w:rPr>
@@ -975,7 +947,7 @@
                 <w:sz w:val="20"/>
                 <w:szCs w:val="20"/>
               </w:rPr>
-              <w:t xml:space="preserve">, et al.</w:t>
+              <w:t xml:space="preserve">, Joseph R. Bennett</w:t>
             </w:r>
           </w:p>
           <w:p>
@@ -990,7 +962,7 @@
                 <w:sz w:val="20"/>
                 <w:szCs w:val="20"/>
               </w:rPr>
-              <w:t xml:space="preserve">BioScience</w:t>
+              <w:t xml:space="preserve">Biological Conservation</w:t>
             </w:r>
             <w:r>
               <w:rPr>
@@ -1000,7 +972,7 @@
               </w:rPr>
               <w:t xml:space="preserve">. </w:t>
             </w:r>
-            <w:hyperlink w:history="1" r:id="rIdvgftjl7dkbj51xe92dk6y">
+            <w:hyperlink w:history="1" r:id="rIdrvwmqzukhmjln3cz6zyiu">
               <w:r>
                 <w:rPr>
                   <w:rFonts w:ascii="Arial" w:cs="Arial" w:eastAsia="Arial" w:hAnsi="Arial"/>
@@ -1098,7 +1070,7 @@
                 <w:sz w:val="20"/>
                 <w:szCs w:val="20"/>
               </w:rPr>
-              <w:t xml:space="preserve">Dimensions of Effective Volunteer Restoration Techniques in North America</w:t>
+              <w:t xml:space="preserve">Parallels between biological invasions and human migration are flawed and undermine both disciplines. Response to Ahmed et al</w:t>
             </w:r>
           </w:p>
           <w:p>
@@ -1108,6 +1080,14 @@
             <w:r>
               <w:rPr>
                 <w:rFonts w:ascii="Arial" w:cs="Arial" w:eastAsia="Arial" w:hAnsi="Arial"/>
+                <w:sz w:val="20"/>
+                <w:szCs w:val="20"/>
+              </w:rPr>
+              <w:t xml:space="preserve">Josie South, Roxana Barbulescu, Rafael L. Macedo, Camille L. Musseau, Simone Guareschi, </w:t>
+            </w:r>
+            <w:r>
+              <w:rPr>
+                <w:rFonts w:ascii="Arial" w:cs="Arial" w:eastAsia="Arial" w:hAnsi="Arial"/>
                 <w:b/>
                 <w:bCs/>
                 <w:sz w:val="20"/>
@@ -1121,7 +1101,7 @@
                 <w:sz w:val="20"/>
                 <w:szCs w:val="20"/>
               </w:rPr>
-              <w:t xml:space="preserve">, Elise Gornish, Stephen D. Murphy</w:t>
+              <w:t xml:space="preserve">, et al.</w:t>
             </w:r>
           </w:p>
           <w:p>
@@ -1136,7 +1116,7 @@
                 <w:sz w:val="20"/>
                 <w:szCs w:val="20"/>
               </w:rPr>
-              <w:t xml:space="preserve">Restoration Ecology</w:t>
+              <w:t xml:space="preserve">BioScience</w:t>
             </w:r>
             <w:r>
               <w:rPr>
@@ -1146,7 +1126,7 @@
               </w:rPr>
               <w:t xml:space="preserve">. </w:t>
             </w:r>
-            <w:hyperlink w:history="1" r:id="rId7ykdu42vumwmnw88ogbo8">
+            <w:hyperlink w:history="1" r:id="rIdg8g6xb3ashtyicn4kk-k5">
               <w:r>
                 <w:rPr>
                   <w:rFonts w:ascii="Arial" w:cs="Arial" w:eastAsia="Arial" w:hAnsi="Arial"/>
@@ -1156,26 +1136,6 @@
                   <w:u w:val="single"/>
                 </w:rPr>
                 <w:t xml:space="preserve">Link</w:t>
-              </w:r>
-            </w:hyperlink>
-            <w:r>
-              <w:rPr>
-                <w:rFonts w:ascii="Arial" w:cs="Arial" w:eastAsia="Arial" w:hAnsi="Arial"/>
-                <w:sz w:val="20"/>
-                <w:szCs w:val="20"/>
-              </w:rPr>
-              <w:t xml:space="preserve"> | </w:t>
-            </w:r>
-            <w:hyperlink w:history="1" r:id="rIdaegqtzlu-dn5ymgqcjknu">
-              <w:r>
-                <w:rPr>
-                  <w:rFonts w:ascii="Arial" w:cs="Arial" w:eastAsia="Arial" w:hAnsi="Arial"/>
-                  <w:color w:val="2980B9"/>
-                  <w:sz w:val="20"/>
-                  <w:szCs w:val="20"/>
-                  <w:u w:val="single"/>
-                </w:rPr>
-                <w:t xml:space="preserve">Audio</w:t>
               </w:r>
             </w:hyperlink>
           </w:p>
@@ -1232,7 +1192,7 @@
                 <w:sz w:val="20"/>
                 <w:szCs w:val="20"/>
               </w:rPr>
-              <w:t xml:space="preserve">[8] 2024</w:t>
+              <w:t xml:space="preserve">[8] 2025</w:t>
             </w:r>
           </w:p>
         </w:tc>
@@ -1264,7 +1224,7 @@
                 <w:sz w:val="20"/>
                 <w:szCs w:val="20"/>
               </w:rPr>
-              <w:t xml:space="preserve">What makes a convivial community tool? Investigating grassroots ecological restoration</w:t>
+              <w:t xml:space="preserve">Dimensions of Effective Volunteer Restoration Techniques in North America</w:t>
             </w:r>
           </w:p>
           <w:p>
@@ -1287,7 +1247,7 @@
                 <w:sz w:val="20"/>
                 <w:szCs w:val="20"/>
               </w:rPr>
-              <w:t xml:space="preserve">, Stephen D. Murphy</w:t>
+              <w:t xml:space="preserve">, Elise Gornish, Stephen D. Murphy</w:t>
             </w:r>
           </w:p>
           <w:p>
@@ -1302,7 +1262,7 @@
                 <w:sz w:val="20"/>
                 <w:szCs w:val="20"/>
               </w:rPr>
-              <w:t xml:space="preserve">Ecology &amp; Society</w:t>
+              <w:t xml:space="preserve">Restoration Ecology</w:t>
             </w:r>
             <w:r>
               <w:rPr>
@@ -1312,7 +1272,7 @@
               </w:rPr>
               <w:t xml:space="preserve">. </w:t>
             </w:r>
-            <w:hyperlink w:history="1" r:id="rIddq5ltpjc9ci8omxs955rj">
+            <w:hyperlink w:history="1" r:id="rIdwnszq2pnj-mazorbi1ggg">
               <w:r>
                 <w:rPr>
                   <w:rFonts w:ascii="Arial" w:cs="Arial" w:eastAsia="Arial" w:hAnsi="Arial"/>
@@ -1332,7 +1292,7 @@
               </w:rPr>
               <w:t xml:space="preserve"> | </w:t>
             </w:r>
-            <w:hyperlink w:history="1" r:id="rIdq2dm-pcxr_xjuqn5yriom">
+            <w:hyperlink w:history="1" r:id="rIddahtnl1e33n4n-hqn7v4n">
               <w:r>
                 <w:rPr>
                   <w:rFonts w:ascii="Arial" w:cs="Arial" w:eastAsia="Arial" w:hAnsi="Arial"/>
@@ -1430,7 +1390,7 @@
                 <w:sz w:val="20"/>
                 <w:szCs w:val="20"/>
               </w:rPr>
-              <w:t xml:space="preserve">Motivations for Volunteers to Participate in Ecological Restoration: A Systematic Map</w:t>
+              <w:t xml:space="preserve">What makes a convivial community tool? Investigating grassroots ecological restoration</w:t>
             </w:r>
           </w:p>
           <w:p>
@@ -1468,7 +1428,7 @@
                 <w:sz w:val="20"/>
                 <w:szCs w:val="20"/>
               </w:rPr>
-              <w:t xml:space="preserve">Restoration Ecology</w:t>
+              <w:t xml:space="preserve">Ecology &amp; Society</w:t>
             </w:r>
             <w:r>
               <w:rPr>
@@ -1478,7 +1438,7 @@
               </w:rPr>
               <w:t xml:space="preserve">. </w:t>
             </w:r>
-            <w:hyperlink w:history="1" r:id="rIdyn4xcuoppwol-hmdhnqxb">
+            <w:hyperlink w:history="1" r:id="rId6v3g7bcvzcn7qcv2ndyw8">
               <w:r>
                 <w:rPr>
                   <w:rFonts w:ascii="Arial" w:cs="Arial" w:eastAsia="Arial" w:hAnsi="Arial"/>
@@ -1498,7 +1458,7 @@
               </w:rPr>
               <w:t xml:space="preserve"> | </w:t>
             </w:r>
-            <w:hyperlink w:history="1" r:id="rIdpi8l7k4ttjcurw-e_w4v9">
+            <w:hyperlink w:history="1" r:id="rIdtesvcvku-wnsybbo7xnsd">
               <w:r>
                 <w:rPr>
                   <w:rFonts w:ascii="Arial" w:cs="Arial" w:eastAsia="Arial" w:hAnsi="Arial"/>
@@ -1564,7 +1524,7 @@
                 <w:sz w:val="20"/>
                 <w:szCs w:val="20"/>
               </w:rPr>
-              <w:t xml:space="preserve">[10] 2023</w:t>
+              <w:t xml:space="preserve">[10] 2024</w:t>
             </w:r>
           </w:p>
         </w:tc>
@@ -1596,7 +1556,7 @@
                 <w:sz w:val="20"/>
                 <w:szCs w:val="20"/>
               </w:rPr>
-              <w:t xml:space="preserve">Ecological Restoration Research in Canada: Who, What, Where, When, Why, and How?</w:t>
+              <w:t xml:space="preserve">Motivations for Volunteers to Participate in Ecological Restoration: A Systematic Map</w:t>
             </w:r>
           </w:p>
           <w:p>
@@ -1619,7 +1579,7 @@
                 <w:sz w:val="20"/>
                 <w:szCs w:val="20"/>
               </w:rPr>
-              <w:t xml:space="preserve">, Dorian Pomezanski, Nancy Shackelford, Stephen D. Murphy, Steven J. Cooke, Line Rochefort, Sonia Voicescu, Eric Higgs</w:t>
+              <w:t xml:space="preserve">, Stephen D. Murphy</w:t>
             </w:r>
           </w:p>
           <w:p>
@@ -1634,7 +1594,7 @@
                 <w:sz w:val="20"/>
                 <w:szCs w:val="20"/>
               </w:rPr>
-              <w:t xml:space="preserve">FACETS</w:t>
+              <w:t xml:space="preserve">Restoration Ecology</w:t>
             </w:r>
             <w:r>
               <w:rPr>
@@ -1644,7 +1604,7 @@
               </w:rPr>
               <w:t xml:space="preserve">. </w:t>
             </w:r>
-            <w:hyperlink w:history="1" r:id="rIdye1fvrnosgohpknanra0t">
+            <w:hyperlink w:history="1" r:id="rId25hpfzc7adh1lugupvn97">
               <w:r>
                 <w:rPr>
                   <w:rFonts w:ascii="Arial" w:cs="Arial" w:eastAsia="Arial" w:hAnsi="Arial"/>
@@ -1664,7 +1624,7 @@
               </w:rPr>
               <w:t xml:space="preserve"> | </w:t>
             </w:r>
-            <w:hyperlink w:history="1" r:id="rIdzcca1d-yq3ahifo9nn4tm">
+            <w:hyperlink w:history="1" r:id="rId2h8kukrdgp2r8w6wsadwe">
               <w:r>
                 <w:rPr>
                   <w:rFonts w:ascii="Arial" w:cs="Arial" w:eastAsia="Arial" w:hAnsi="Arial"/>
@@ -1730,7 +1690,7 @@
                 <w:sz w:val="20"/>
                 <w:szCs w:val="20"/>
               </w:rPr>
-              <w:t xml:space="preserve">[11] 2022</w:t>
+              <w:t xml:space="preserve">[11] 2023</w:t>
             </w:r>
           </w:p>
         </w:tc>
@@ -1762,7 +1722,7 @@
                 <w:sz w:val="20"/>
                 <w:szCs w:val="20"/>
               </w:rPr>
-              <w:t xml:space="preserve">Creating Testable Questions in Practical Conservation</w:t>
+              <w:t xml:space="preserve">Ecological Restoration Research in Canada: Who, What, Where, When, Why, and How?</w:t>
             </w:r>
           </w:p>
           <w:p>
@@ -1772,14 +1732,6 @@
             <w:r>
               <w:rPr>
                 <w:rFonts w:ascii="Arial" w:cs="Arial" w:eastAsia="Arial" w:hAnsi="Arial"/>
-                <w:sz w:val="20"/>
-                <w:szCs w:val="20"/>
-              </w:rPr>
-              <w:t xml:space="preserve">William J. Sutherland, Jake M. Robinson, David C. Aldridge, </w:t>
-            </w:r>
-            <w:r>
-              <w:rPr>
-                <w:rFonts w:ascii="Arial" w:cs="Arial" w:eastAsia="Arial" w:hAnsi="Arial"/>
                 <w:b/>
                 <w:bCs/>
                 <w:sz w:val="20"/>
@@ -1793,7 +1745,7 @@
                 <w:sz w:val="20"/>
                 <w:szCs w:val="20"/>
               </w:rPr>
-              <w:t xml:space="preserve">, Matthew Armes, Nina Baranduin, Andrew J. Bladon, et al.</w:t>
+              <w:t xml:space="preserve">, Dorian Pomezanski, Nancy Shackelford, Stephen D. Murphy, Steven J. Cooke, Line Rochefort, Sonia Voicescu, Eric Higgs</w:t>
             </w:r>
           </w:p>
           <w:p>
@@ -1808,7 +1760,7 @@
                 <w:sz w:val="20"/>
                 <w:szCs w:val="20"/>
               </w:rPr>
-              <w:t xml:space="preserve">Conservation Evidence Journal</w:t>
+              <w:t xml:space="preserve">FACETS</w:t>
             </w:r>
             <w:r>
               <w:rPr>
@@ -1818,7 +1770,7 @@
               </w:rPr>
               <w:t xml:space="preserve">. </w:t>
             </w:r>
-            <w:hyperlink w:history="1" r:id="rIdyctgzqoqzdgyxfdk7b6jn">
+            <w:hyperlink w:history="1" r:id="rIdadbl11c0i_7rebqkaosz5">
               <w:r>
                 <w:rPr>
                   <w:rFonts w:ascii="Arial" w:cs="Arial" w:eastAsia="Arial" w:hAnsi="Arial"/>
@@ -1828,6 +1780,26 @@
                   <w:u w:val="single"/>
                 </w:rPr>
                 <w:t xml:space="preserve">Link</w:t>
+              </w:r>
+            </w:hyperlink>
+            <w:r>
+              <w:rPr>
+                <w:rFonts w:ascii="Arial" w:cs="Arial" w:eastAsia="Arial" w:hAnsi="Arial"/>
+                <w:sz w:val="20"/>
+                <w:szCs w:val="20"/>
+              </w:rPr>
+              <w:t xml:space="preserve"> | </w:t>
+            </w:r>
+            <w:hyperlink w:history="1" r:id="rIdd0ybcrt_fv6lrziucj3it">
+              <w:r>
+                <w:rPr>
+                  <w:rFonts w:ascii="Arial" w:cs="Arial" w:eastAsia="Arial" w:hAnsi="Arial"/>
+                  <w:color w:val="2980B9"/>
+                  <w:sz w:val="20"/>
+                  <w:szCs w:val="20"/>
+                  <w:u w:val="single"/>
+                </w:rPr>
+                <w:t xml:space="preserve">Audio</w:t>
               </w:r>
             </w:hyperlink>
           </w:p>
@@ -1884,7 +1856,7 @@
                 <w:sz w:val="20"/>
                 <w:szCs w:val="20"/>
               </w:rPr>
-              <w:t xml:space="preserve">[12] 2020</w:t>
+              <w:t xml:space="preserve">[12] 2022</w:t>
             </w:r>
           </w:p>
         </w:tc>
@@ -1916,7 +1888,7 @@
                 <w:sz w:val="20"/>
                 <w:szCs w:val="20"/>
               </w:rPr>
-              <w:t xml:space="preserve">What Will a PhD Look Like in the Future?</w:t>
+              <w:t xml:space="preserve">Creating Testable Questions in Practical Conservation</w:t>
             </w:r>
           </w:p>
           <w:p>
@@ -1929,7 +1901,7 @@
                 <w:sz w:val="20"/>
                 <w:szCs w:val="20"/>
               </w:rPr>
-              <w:t xml:space="preserve">Anita Lazurko, </w:t>
+              <w:t xml:space="preserve">William J. Sutherland, Jake M. Robinson, David C. Aldridge, </w:t>
             </w:r>
             <w:r>
               <w:rPr>
@@ -1947,7 +1919,7 @@
                 <w:sz w:val="20"/>
                 <w:szCs w:val="20"/>
               </w:rPr>
-              <w:t xml:space="preserve">, Lowine Stella Hill, Ella-Kari Muhl, Augustine Kwame Osei, Dorian Pomezanski, Kyle Schang, Dilruba Fatima Sharmin</w:t>
+              <w:t xml:space="preserve">, Matthew Armes, Nina Baranduin, Andrew J. Bladon, et al.</w:t>
             </w:r>
           </w:p>
           <w:p>
@@ -1962,7 +1934,7 @@
                 <w:sz w:val="20"/>
                 <w:szCs w:val="20"/>
               </w:rPr>
-              <w:t xml:space="preserve">World Futures Review</w:t>
+              <w:t xml:space="preserve">Conservation Evidence Journal</w:t>
             </w:r>
             <w:r>
               <w:rPr>
@@ -1972,7 +1944,7 @@
               </w:rPr>
               <w:t xml:space="preserve">. </w:t>
             </w:r>
-            <w:hyperlink w:history="1" r:id="rIddhmpo3qmsd0jojdmmm8up">
+            <w:hyperlink w:history="1" r:id="rIdbvgxrjo1yczxomyy7ycq8">
               <w:r>
                 <w:rPr>
                   <w:rFonts w:ascii="Arial" w:cs="Arial" w:eastAsia="Arial" w:hAnsi="Arial"/>
@@ -1992,23 +1964,6 @@
       <w:pPr>
         <w:spacing w:after="100" w:before="0"/>
       </w:pPr>
-    </w:p>
-    <w:p>
-      <w:pPr>
-        <w:pStyle w:val="Heading2"/>
-        <w:spacing w:after="80" w:before="300"/>
-      </w:pPr>
-      <w:r>
-        <w:rPr>
-          <w:rFonts w:ascii="Arial" w:cs="Arial" w:eastAsia="Arial" w:hAnsi="Arial"/>
-          <w:b/>
-          <w:bCs/>
-          <w:color w:val="1B4F72"/>
-          <w:sz w:val="26"/>
-          <w:szCs w:val="26"/>
-        </w:rPr>
-        <w:t xml:space="preserve">Peer-Reviewed Publications in Progress</w:t>
-      </w:r>
     </w:p>
     <w:tbl>
       <w:tblPr>
@@ -2055,7 +2010,7 @@
                 <w:sz w:val="20"/>
                 <w:szCs w:val="20"/>
               </w:rPr>
-              <w:t xml:space="preserve">[1] 2026</w:t>
+              <w:t xml:space="preserve">[13] 2020</w:t>
             </w:r>
           </w:p>
         </w:tc>
@@ -2087,7 +2042,7 @@
                 <w:sz w:val="20"/>
                 <w:szCs w:val="20"/>
               </w:rPr>
-              <w:t xml:space="preserve">Machines in the loop: Challenges and opportunities for environmental evidence synthesis research in the artificial intelligence era</w:t>
+              <w:t xml:space="preserve">What Will a PhD Look Like in the Future?</w:t>
             </w:r>
           </w:p>
           <w:p>
@@ -2097,6 +2052,14 @@
             <w:r>
               <w:rPr>
                 <w:rFonts w:ascii="Arial" w:cs="Arial" w:eastAsia="Arial" w:hAnsi="Arial"/>
+                <w:sz w:val="20"/>
+                <w:szCs w:val="20"/>
+              </w:rPr>
+              <w:t xml:space="preserve">Anita Lazurko, </w:t>
+            </w:r>
+            <w:r>
+              <w:rPr>
+                <w:rFonts w:ascii="Arial" w:cs="Arial" w:eastAsia="Arial" w:hAnsi="Arial"/>
                 <w:b/>
                 <w:bCs/>
                 <w:sz w:val="20"/>
@@ -2110,7 +2073,7 @@
                 <w:sz w:val="20"/>
                 <w:szCs w:val="20"/>
               </w:rPr>
-              <w:t xml:space="preserve">, Amy Bachhuber, Joseph R. Bennett, Steven J. Cooke, Kian L. Drew, Daniel Dylewsky, Emily McKnight, Pat Moore, Ana Hernandez Martinez De La Riva, Bronwyn Rayfield</w:t>
+              <w:t xml:space="preserve">, Lowine Stella Hill, Ella-Kari Muhl, Augustine Kwame Osei, Dorian Pomezanski, Kyle Schang, Dilruba Fatima Sharmin</w:t>
             </w:r>
           </w:p>
           <w:p>
@@ -2125,8 +2088,28 @@
                 <w:sz w:val="20"/>
                 <w:szCs w:val="20"/>
               </w:rPr>
-              <w:t xml:space="preserve">FACETS</w:t>
-            </w:r>
+              <w:t xml:space="preserve">World Futures Review</w:t>
+            </w:r>
+            <w:r>
+              <w:rPr>
+                <w:rFonts w:ascii="Arial" w:cs="Arial" w:eastAsia="Arial" w:hAnsi="Arial"/>
+                <w:sz w:val="20"/>
+                <w:szCs w:val="20"/>
+              </w:rPr>
+              <w:t xml:space="preserve">. </w:t>
+            </w:r>
+            <w:hyperlink w:history="1" r:id="rIdn26xr--rup4exj8butvra">
+              <w:r>
+                <w:rPr>
+                  <w:rFonts w:ascii="Arial" w:cs="Arial" w:eastAsia="Arial" w:hAnsi="Arial"/>
+                  <w:color w:val="2980B9"/>
+                  <w:sz w:val="20"/>
+                  <w:szCs w:val="20"/>
+                  <w:u w:val="single"/>
+                </w:rPr>
+                <w:t xml:space="preserve">Link</w:t>
+              </w:r>
+            </w:hyperlink>
           </w:p>
         </w:tc>
       </w:tr>
@@ -2135,6 +2118,23 @@
       <w:pPr>
         <w:spacing w:after="100" w:before="0"/>
       </w:pPr>
+    </w:p>
+    <w:p>
+      <w:pPr>
+        <w:pStyle w:val="Heading2"/>
+        <w:spacing w:after="80" w:before="300"/>
+      </w:pPr>
+      <w:r>
+        <w:rPr>
+          <w:rFonts w:ascii="Arial" w:cs="Arial" w:eastAsia="Arial" w:hAnsi="Arial"/>
+          <w:b/>
+          <w:bCs/>
+          <w:color w:val="1B4F72"/>
+          <w:sz w:val="26"/>
+          <w:szCs w:val="26"/>
+        </w:rPr>
+        <w:t xml:space="preserve">Peer-Reviewed Publications in Progress</w:t>
+      </w:r>
     </w:p>
     <w:tbl>
       <w:tblPr>
@@ -2181,7 +2181,7 @@
                 <w:sz w:val="20"/>
                 <w:szCs w:val="20"/>
               </w:rPr>
-              <w:t xml:space="preserve">[2] 2026</w:t>
+              <w:t xml:space="preserve">[1] 2026</w:t>
             </w:r>
           </w:p>
         </w:tc>
@@ -2213,7 +2213,7 @@
                 <w:sz w:val="20"/>
                 <w:szCs w:val="20"/>
               </w:rPr>
-              <w:t xml:space="preserve">Operationalizing the CARE principles in evidence synthesis for ecology and conservation</w:t>
+              <w:t xml:space="preserve">Machines in the loop: Challenges and opportunities for environmental evidence synthesis research in the artificial intelligence era</w:t>
             </w:r>
           </w:p>
           <w:p>
@@ -2223,14 +2223,6 @@
             <w:r>
               <w:rPr>
                 <w:rFonts w:ascii="Arial" w:cs="Arial" w:eastAsia="Arial" w:hAnsi="Arial"/>
-                <w:sz w:val="20"/>
-                <w:szCs w:val="20"/>
-              </w:rPr>
-              <w:t xml:space="preserve">Federica Bocchi, Aline Potiron, Eleonore Slabbert, </w:t>
-            </w:r>
-            <w:r>
-              <w:rPr>
-                <w:rFonts w:ascii="Arial" w:cs="Arial" w:eastAsia="Arial" w:hAnsi="Arial"/>
                 <w:b/>
                 <w:bCs/>
                 <w:sz w:val="20"/>
@@ -2244,7 +2236,7 @@
                 <w:sz w:val="20"/>
                 <w:szCs w:val="20"/>
               </w:rPr>
-              <w:t xml:space="preserve">, Anika Grose, Birgitta Konig-Ries, Lotte Korell, Carlos Santana, Tina Heger</w:t>
+              <w:t xml:space="preserve">, Amy Bachhuber, Joseph R. Bennett, Steven J. Cooke, Kian L. Drew, Daniel Dylewsky, Emily McKnight, Pat Moore, Ana Hernandez Martinez De La Riva, Bronwyn Rayfield</w:t>
             </w:r>
           </w:p>
           <w:p>
@@ -2259,7 +2251,7 @@
                 <w:sz w:val="20"/>
                 <w:szCs w:val="20"/>
               </w:rPr>
-              <w:t xml:space="preserve">Nature Communications</w:t>
+              <w:t xml:space="preserve">FACETS</w:t>
             </w:r>
           </w:p>
         </w:tc>
@@ -2315,7 +2307,7 @@
                 <w:sz w:val="20"/>
                 <w:szCs w:val="20"/>
               </w:rPr>
-              <w:t xml:space="preserve">[3] 2026</w:t>
+              <w:t xml:space="preserve">[2] 2026</w:t>
             </w:r>
           </w:p>
         </w:tc>
@@ -2347,7 +2339,7 @@
                 <w:sz w:val="20"/>
                 <w:szCs w:val="20"/>
               </w:rPr>
-              <w:t xml:space="preserve">Which Aspects of Restoration Project Organization Affect Volunteer Engagement in Community-Based Initiatives?</w:t>
+              <w:t xml:space="preserve">Operationalizing the CARE principles in evidence synthesis for ecology and conservation</w:t>
             </w:r>
           </w:p>
           <w:p>
@@ -2357,6 +2349,14 @@
             <w:r>
               <w:rPr>
                 <w:rFonts w:ascii="Arial" w:cs="Arial" w:eastAsia="Arial" w:hAnsi="Arial"/>
+                <w:sz w:val="20"/>
+                <w:szCs w:val="20"/>
+              </w:rPr>
+              <w:t xml:space="preserve">Federica Bocchi, Aline Potiron, Eleonore Slabbert, </w:t>
+            </w:r>
+            <w:r>
+              <w:rPr>
+                <w:rFonts w:ascii="Arial" w:cs="Arial" w:eastAsia="Arial" w:hAnsi="Arial"/>
                 <w:b/>
                 <w:bCs/>
                 <w:sz w:val="20"/>
@@ -2370,7 +2370,7 @@
                 <w:sz w:val="20"/>
                 <w:szCs w:val="20"/>
               </w:rPr>
-              <w:t xml:space="preserve">, Stephen D. Murphy</w:t>
+              <w:t xml:space="preserve">, Anika Grose, Birgitta Konig-Ries, Lotte Korell, Carlos Santana, Tina Heger</w:t>
             </w:r>
           </w:p>
           <w:p>
@@ -2385,7 +2385,7 @@
                 <w:sz w:val="20"/>
                 <w:szCs w:val="20"/>
               </w:rPr>
-              <w:t xml:space="preserve">Restoration Ecology</w:t>
+              <w:t xml:space="preserve">Nature Communications</w:t>
             </w:r>
           </w:p>
         </w:tc>
@@ -2538,7 +2538,7 @@
               </w:rPr>
               <w:t xml:space="preserve">. </w:t>
             </w:r>
-            <w:hyperlink w:history="1" r:id="rIdzvdrr2a2-biaddwp5btss">
+            <w:hyperlink w:history="1" r:id="rIdfh4pm8jtgipfi0d1n7tgx">
               <w:r>
                 <w:rPr>
                   <w:rFonts w:ascii="Arial" w:cs="Arial" w:eastAsia="Arial" w:hAnsi="Arial"/>
@@ -2709,7 +2709,7 @@
               </w:rPr>
               <w:t xml:space="preserve">. </w:t>
             </w:r>
-            <w:hyperlink w:history="1" r:id="rIdzv6zx18qta2mb99lb2yrb">
+            <w:hyperlink w:history="1" r:id="rIdv8yrnagcqowzveiw8huw4">
               <w:r>
                 <w:rPr>
                   <w:rFonts w:ascii="Arial" w:cs="Arial" w:eastAsia="Arial" w:hAnsi="Arial"/>
@@ -2836,7 +2836,7 @@
           <w:sz w:val="20"/>
           <w:szCs w:val="20"/>
         </w:rPr>
-        <w:t xml:space="preserve">"The John Connor Guide to Life with LLMs"</w:t>
+        <w:t xml:space="preserve">"Indigenous data sovereignty in computational ecological knowledge integration"</w:t>
       </w:r>
       <w:r>
         <w:rPr>
@@ -2872,7 +2872,7 @@
           <w:sz w:val="20"/>
           <w:szCs w:val="20"/>
         </w:rPr>
-        <w:t xml:space="preserve">"EcoWeaver Workbench — hands-on schema prototyping"</w:t>
+        <w:t xml:space="preserve">"EcoWeaver Workbench - hands-on schema prototyping"</w:t>
       </w:r>
       <w:r>
         <w:rPr>
@@ -2908,7 +2908,7 @@
           <w:sz w:val="20"/>
           <w:szCs w:val="20"/>
         </w:rPr>
-        <w:t xml:space="preserve">"Indigenous data sovereignty in computational ecological knowledge integration"</w:t>
+        <w:t xml:space="preserve">"AI and decision support tools for land trusts"</w:t>
       </w:r>
       <w:r>
         <w:rPr>
@@ -2980,7 +2980,7 @@
           <w:sz w:val="20"/>
           <w:szCs w:val="20"/>
         </w:rPr>
-        <w:t xml:space="preserve">"AI and decision support tools for land trusts"</w:t>
+        <w:t xml:space="preserve">"Ecolink: Towards a Knowledge Graph Schema for Complex Environmental Systems."</w:t>
       </w:r>
       <w:r>
         <w:rPr>
@@ -2996,7 +2996,7 @@
           <w:sz w:val="20"/>
           <w:szCs w:val="20"/>
         </w:rPr>
-        <w:t xml:space="preserve"> (2026).</w:t>
+        <w:t xml:space="preserve"> (2025).</w:t>
       </w:r>
     </w:p>
     <w:p>
@@ -3016,7 +3016,7 @@
           <w:sz w:val="20"/>
           <w:szCs w:val="20"/>
         </w:rPr>
-        <w:t xml:space="preserve">"Mapping Evidence to Theory in Ecology."</w:t>
+        <w:t xml:space="preserve">"Toolkit for Restoration Ecology Knowledge (TReK)."</w:t>
       </w:r>
       <w:r>
         <w:rPr>
@@ -3052,7 +3052,7 @@
           <w:sz w:val="20"/>
           <w:szCs w:val="20"/>
         </w:rPr>
-        <w:t xml:space="preserve">"Ecolink: Towards a Knowledge Graph Schema for Complex Environmental Systems."</w:t>
+        <w:t xml:space="preserve">"Three stories of restoration and conservation engagement."</w:t>
       </w:r>
       <w:r>
         <w:rPr>
@@ -3088,7 +3088,7 @@
           <w:sz w:val="20"/>
           <w:szCs w:val="20"/>
         </w:rPr>
-        <w:t xml:space="preserve">"Toolkit for Restoration Ecology Knowledge (TReK)."</w:t>
+        <w:t xml:space="preserve">"Mapping Evidence to Theory in Ecology."</w:t>
       </w:r>
       <w:r>
         <w:rPr>
@@ -3124,7 +3124,7 @@
           <w:sz w:val="20"/>
           <w:szCs w:val="20"/>
         </w:rPr>
-        <w:t xml:space="preserve">"Three stories of restoration and conservation engagement."</w:t>
+        <w:t xml:space="preserve">"How to recruit and retain more volunteers."</w:t>
       </w:r>
       <w:r>
         <w:rPr>
@@ -3140,7 +3140,7 @@
           <w:sz w:val="20"/>
           <w:szCs w:val="20"/>
         </w:rPr>
-        <w:t xml:space="preserve"> (2025).</w:t>
+        <w:t xml:space="preserve"> (2024).</w:t>
       </w:r>
     </w:p>
     <w:p>
@@ -3196,7 +3196,7 @@
           <w:sz w:val="20"/>
           <w:szCs w:val="20"/>
         </w:rPr>
-        <w:t xml:space="preserve">"Lowering barriers, changing behaviours."</w:t>
+        <w:t xml:space="preserve">"Fuzzy cognitive mapping using knowledge graphs for restoration ecology."</w:t>
       </w:r>
       <w:r>
         <w:rPr>
@@ -3232,7 +3232,7 @@
           <w:sz w:val="20"/>
           <w:szCs w:val="20"/>
         </w:rPr>
-        <w:t xml:space="preserve">"Knowledge Graphs for Land-Based Knowledges: Encoding Restoration Ecology and Environmental History."</w:t>
+        <w:t xml:space="preserve">"Taming Complexity: AI Approaches to Knowledge Synthesis."</w:t>
       </w:r>
       <w:r>
         <w:rPr>
@@ -3268,7 +3268,7 @@
           <w:sz w:val="20"/>
           <w:szCs w:val="20"/>
         </w:rPr>
-        <w:t xml:space="preserve">"Fuzzy cognitive mapping using knowledge graphs for restoration ecology."</w:t>
+        <w:t xml:space="preserve">"Taming Complexity in Ecology."</w:t>
       </w:r>
       <w:r>
         <w:rPr>
@@ -3304,7 +3304,7 @@
           <w:sz w:val="20"/>
           <w:szCs w:val="20"/>
         </w:rPr>
-        <w:t xml:space="preserve">"Volunteer engagement in ecological restoration."</w:t>
+        <w:t xml:space="preserve">"Lowering barriers, changing behaviours."</w:t>
       </w:r>
       <w:r>
         <w:rPr>
@@ -3340,7 +3340,7 @@
           <w:sz w:val="20"/>
           <w:szCs w:val="20"/>
         </w:rPr>
-        <w:t xml:space="preserve">"Taming Complexity in Ecology."</w:t>
+        <w:t xml:space="preserve">"Knowledge Graphs for Land-Based Knowledges: Encoding Restoration Ecology and Environmental History."</w:t>
       </w:r>
       <w:r>
         <w:rPr>
@@ -3376,7 +3376,7 @@
           <w:sz w:val="20"/>
           <w:szCs w:val="20"/>
         </w:rPr>
-        <w:t xml:space="preserve">"Taming Complexity: AI Approaches to Knowledge Synthesis."</w:t>
+        <w:t xml:space="preserve">"Mapping and assessing evidence in ecological restoration."</w:t>
       </w:r>
       <w:r>
         <w:rPr>
@@ -3412,7 +3412,7 @@
           <w:sz w:val="20"/>
           <w:szCs w:val="20"/>
         </w:rPr>
-        <w:t xml:space="preserve">"People-powered ecosystem restoration."</w:t>
+        <w:t xml:space="preserve">"Mapping evidence to theory in ecology: Addressing the challenges of generalization and causality."</w:t>
       </w:r>
       <w:r>
         <w:rPr>
@@ -3484,7 +3484,7 @@
           <w:sz w:val="20"/>
           <w:szCs w:val="20"/>
         </w:rPr>
-        <w:t xml:space="preserve">"Mapping evidence to theory in ecology: Addressing the challenges of generalization and causality."</w:t>
+        <w:t xml:space="preserve">"People-powered ecosystem restoration."</w:t>
       </w:r>
       <w:r>
         <w:rPr>
@@ -3520,7 +3520,7 @@
           <w:sz w:val="20"/>
           <w:szCs w:val="20"/>
         </w:rPr>
-        <w:t xml:space="preserve">"Mapping and assessing evidence in ecological restoration."</w:t>
+        <w:t xml:space="preserve">"Volunteer engagement in ecological restoration."</w:t>
       </w:r>
       <w:r>
         <w:rPr>
@@ -3556,7 +3556,7 @@
           <w:sz w:val="20"/>
           <w:szCs w:val="20"/>
         </w:rPr>
-        <w:t xml:space="preserve">"How to recruit and retain more volunteers."</w:t>
+        <w:t xml:space="preserve">"Volunteer engagement in ecological restoration."</w:t>
       </w:r>
       <w:r>
         <w:rPr>
@@ -3572,7 +3572,7 @@
           <w:sz w:val="20"/>
           <w:szCs w:val="20"/>
         </w:rPr>
-        <w:t xml:space="preserve"> (2024).</w:t>
+        <w:t xml:space="preserve"> (2023).</w:t>
       </w:r>
     </w:p>
     <w:p>
@@ -3592,7 +3592,7 @@
           <w:sz w:val="20"/>
           <w:szCs w:val="20"/>
         </w:rPr>
-        <w:t xml:space="preserve">"Volunteer engagement in ecological restoration."</w:t>
+        <w:t xml:space="preserve">"Ecological Restoration Research in Canada: Who, What, Where, When, Why and How?"</w:t>
       </w:r>
       <w:r>
         <w:rPr>
@@ -3628,7 +3628,7 @@
           <w:sz w:val="20"/>
           <w:szCs w:val="20"/>
         </w:rPr>
-        <w:t xml:space="preserve">"Ecological Restoration Research in Canada: Who, What, Where, When, Why and How?"</w:t>
+        <w:t xml:space="preserve">"Advocacy 101: How to talk about climate change with politicians."</w:t>
       </w:r>
       <w:r>
         <w:rPr>
@@ -3644,7 +3644,7 @@
           <w:sz w:val="20"/>
           <w:szCs w:val="20"/>
         </w:rPr>
-        <w:t xml:space="preserve"> (2023).</w:t>
+        <w:t xml:space="preserve"> (2022).</w:t>
       </w:r>
     </w:p>
     <w:p>
@@ -3664,7 +3664,7 @@
           <w:sz w:val="20"/>
           <w:szCs w:val="20"/>
         </w:rPr>
-        <w:t xml:space="preserve">"Comparing community-led tree planting programs."</w:t>
+        <w:t xml:space="preserve">"Guest speaker."</w:t>
       </w:r>
       <w:r>
         <w:rPr>
@@ -3736,7 +3736,7 @@
           <w:sz w:val="20"/>
           <w:szCs w:val="20"/>
         </w:rPr>
-        <w:t xml:space="preserve">"Guest speaker."</w:t>
+        <w:t xml:space="preserve">"Comparing community-led tree planting programs."</w:t>
       </w:r>
       <w:r>
         <w:rPr>
@@ -3772,7 +3772,7 @@
           <w:sz w:val="20"/>
           <w:szCs w:val="20"/>
         </w:rPr>
-        <w:t xml:space="preserve">"Advocacy 101: How to talk about climate change with politicians."</w:t>
+        <w:t xml:space="preserve">"Working Together and Giving Back: Building and sustaining volunteer motivation."</w:t>
       </w:r>
       <w:r>
         <w:rPr>
@@ -3788,7 +3788,7 @@
           <w:sz w:val="20"/>
           <w:szCs w:val="20"/>
         </w:rPr>
-        <w:t xml:space="preserve"> (2022).</w:t>
+        <w:t xml:space="preserve"> (2021).</w:t>
       </w:r>
     </w:p>
     <w:p>
@@ -3808,7 +3808,7 @@
           <w:sz w:val="20"/>
           <w:szCs w:val="20"/>
         </w:rPr>
-        <w:t xml:space="preserve">"Ecological Restoration: Nature-Based Solutions for Climate Mitigation and Engaging Canadians with Nature."</w:t>
+        <w:t xml:space="preserve">"Charting the evidence landscape: A systematic map and bibliometric analysis of ecological restoration in Canada."</w:t>
       </w:r>
       <w:r>
         <w:rPr>
@@ -3880,7 +3880,7 @@
           <w:sz w:val="20"/>
           <w:szCs w:val="20"/>
         </w:rPr>
-        <w:t xml:space="preserve">"Charting the evidence landscape: A systematic map and bibliometric analysis of ecological restoration in Canada."</w:t>
+        <w:t xml:space="preserve">"Ecological Restoration: Nature-Based Solutions for Climate Mitigation and Engaging Canadians with Nature."</w:t>
       </w:r>
       <w:r>
         <w:rPr>
@@ -3916,7 +3916,7 @@
           <w:sz w:val="20"/>
           <w:szCs w:val="20"/>
         </w:rPr>
-        <w:t xml:space="preserve">"Facilitator."</w:t>
+        <w:t xml:space="preserve">"How to design techniques for volunteer ecological restoration."</w:t>
       </w:r>
       <w:r>
         <w:rPr>
@@ -3952,7 +3952,7 @@
           <w:sz w:val="20"/>
           <w:szCs w:val="20"/>
         </w:rPr>
-        <w:t xml:space="preserve">"How to design techniques for volunteer ecological restoration."</w:t>
+        <w:t xml:space="preserve">"Decolonizing Worldviews: Unpacking nature and wilderness."</w:t>
       </w:r>
       <w:r>
         <w:rPr>
@@ -3988,7 +3988,7 @@
           <w:sz w:val="20"/>
           <w:szCs w:val="20"/>
         </w:rPr>
-        <w:t xml:space="preserve">"Decolonizing Worldviews: Unpacking nature and wilderness."</w:t>
+        <w:t xml:space="preserve">"Facilitator."</w:t>
       </w:r>
       <w:r>
         <w:rPr>
@@ -4024,7 +4024,7 @@
           <w:sz w:val="20"/>
           <w:szCs w:val="20"/>
         </w:rPr>
-        <w:t xml:space="preserve">"Working Together and Giving Back: Building and sustaining volunteer motivation."</w:t>
+        <w:t xml:space="preserve">"Assessment in restoration ecology."</w:t>
       </w:r>
       <w:r>
         <w:rPr>
@@ -4040,7 +4040,7 @@
           <w:sz w:val="20"/>
           <w:szCs w:val="20"/>
         </w:rPr>
-        <w:t xml:space="preserve"> (2021).</w:t>
+        <w:t xml:space="preserve"> (2020).</w:t>
       </w:r>
     </w:p>
     <w:p>
@@ -4061,42 +4061,6 @@
           <w:szCs w:val="20"/>
         </w:rPr>
         <w:t xml:space="preserve">"Who gets to care for nature? Participation in ecological restoration."</w:t>
-      </w:r>
-      <w:r>
-        <w:rPr>
-          <w:rFonts w:ascii="Arial" w:cs="Arial" w:eastAsia="Arial" w:hAnsi="Arial"/>
-          <w:sz w:val="20"/>
-          <w:szCs w:val="20"/>
-        </w:rPr>
-        <w:t xml:space="preserve">. </w:t>
-      </w:r>
-      <w:r>
-        <w:rPr>
-          <w:rFonts w:ascii="Arial" w:cs="Arial" w:eastAsia="Arial" w:hAnsi="Arial"/>
-          <w:sz w:val="20"/>
-          <w:szCs w:val="20"/>
-        </w:rPr>
-        <w:t xml:space="preserve"> (2020).</w:t>
-      </w:r>
-    </w:p>
-    <w:p>
-      <w:pPr>
-        <w:pStyle w:val="ListParagraph"/>
-        <w:numPr>
-          <w:ilvl w:val="0"/>
-          <w:numId w:val="2"/>
-        </w:numPr>
-        <w:spacing w:after="60" w:before="60"/>
-      </w:pPr>
-      <w:r>
-        <w:rPr>
-          <w:rFonts w:ascii="Arial" w:cs="Arial" w:eastAsia="Arial" w:hAnsi="Arial"/>
-          <w:b/>
-          <w:bCs/>
-          <w:sz w:val="20"/>
-          <w:szCs w:val="20"/>
-        </w:rPr>
-        <w:t xml:space="preserve">"Assessment in restoration ecology."</w:t>
       </w:r>
       <w:r>
         <w:rPr>

</xml_diff>

<commit_message>
Updated publications w audio link
</commit_message>
<xml_diff>
--- a/docx/Alamenciak_CV.docx
+++ b/docx/Alamenciak_CV.docx
@@ -50,7 +50,7 @@
       <w:pPr>
         <w:spacing w:after="40" w:before="0"/>
       </w:pPr>
-      <w:hyperlink w:history="1" r:id="rIdg2wkc0sufbbmiim_rach9">
+      <w:hyperlink w:history="1" r:id="rIdnsx0ltvlx7g_ysfa9hvaw">
         <w:r>
           <w:rPr>
             <w:rFonts w:ascii="Arial" w:cs="Arial" w:eastAsia="Arial" w:hAnsi="Arial"/>
@@ -70,7 +70,7 @@
         </w:rPr>
         <w:t xml:space="preserve">  |  </w:t>
       </w:r>
-      <w:hyperlink w:history="1" r:id="rId_jr7gnqsojvdhfdaibcib">
+      <w:hyperlink w:history="1" r:id="rIddipymesktjb50rxmd8haz">
         <w:r>
           <w:rPr>
             <w:rFonts w:ascii="Arial" w:cs="Arial" w:eastAsia="Arial" w:hAnsi="Arial"/>
@@ -238,7 +238,7 @@
               </w:rPr>
               <w:t xml:space="preserve">. </w:t>
             </w:r>
-            <w:hyperlink w:history="1" r:id="rIdh5vdpkx1gumoqeuylo8x0">
+            <w:hyperlink w:history="1" r:id="rIdhv2_t2zlevzeh4f2m_pgu">
               <w:r>
                 <w:rPr>
                   <w:rFonts w:ascii="Arial" w:cs="Arial" w:eastAsia="Arial" w:hAnsi="Arial"/>
@@ -392,7 +392,7 @@
               </w:rPr>
               <w:t xml:space="preserve">. </w:t>
             </w:r>
-            <w:hyperlink w:history="1" r:id="rIdis7rwn51gnucteqnxishg">
+            <w:hyperlink w:history="1" r:id="rId17paz8sl_s86lpriiykcv">
               <w:r>
                 <w:rPr>
                   <w:rFonts w:ascii="Arial" w:cs="Arial" w:eastAsia="Arial" w:hAnsi="Arial"/>
@@ -538,7 +538,7 @@
               </w:rPr>
               <w:t xml:space="preserve">. </w:t>
             </w:r>
-            <w:hyperlink w:history="1" r:id="rIdf5rjhidojyidnh6ooh_nm">
+            <w:hyperlink w:history="1" r:id="rIdb2ccktdneg8j8urayowop">
               <w:r>
                 <w:rPr>
                   <w:rFonts w:ascii="Arial" w:cs="Arial" w:eastAsia="Arial" w:hAnsi="Arial"/>
@@ -684,7 +684,7 @@
               </w:rPr>
               <w:t xml:space="preserve">. </w:t>
             </w:r>
-            <w:hyperlink w:history="1" r:id="rIdimgjej7dl9idztkpx60nd">
+            <w:hyperlink w:history="1" r:id="rId6rk1ong6muiu9ah9s4sks">
               <w:r>
                 <w:rPr>
                   <w:rFonts w:ascii="Arial" w:cs="Arial" w:eastAsia="Arial" w:hAnsi="Arial"/>
@@ -830,7 +830,7 @@
               </w:rPr>
               <w:t xml:space="preserve">. </w:t>
             </w:r>
-            <w:hyperlink w:history="1" r:id="rIdjoiv86vxoaazfs0hyauur">
+            <w:hyperlink w:history="1" r:id="rIdh-bqmhf8t7wben8xpti1k">
               <w:r>
                 <w:rPr>
                   <w:rFonts w:ascii="Arial" w:cs="Arial" w:eastAsia="Arial" w:hAnsi="Arial"/>
@@ -984,7 +984,7 @@
               </w:rPr>
               <w:t xml:space="preserve">. </w:t>
             </w:r>
-            <w:hyperlink w:history="1" r:id="rIdcggzr_uyrxk-hb3y8nu6k">
+            <w:hyperlink w:history="1" r:id="rIdwlocom3w5wr8hhbc0nl9z">
               <w:r>
                 <w:rPr>
                   <w:rFonts w:ascii="Arial" w:cs="Arial" w:eastAsia="Arial" w:hAnsi="Arial"/>
@@ -1138,7 +1138,7 @@
               </w:rPr>
               <w:t xml:space="preserve">. </w:t>
             </w:r>
-            <w:hyperlink w:history="1" r:id="rIdf_98q_pv3ggr28mltqgai">
+            <w:hyperlink w:history="1" r:id="rIdmxisgdh1vrs-qh8olpcso">
               <w:r>
                 <w:rPr>
                   <w:rFonts w:ascii="Arial" w:cs="Arial" w:eastAsia="Arial" w:hAnsi="Arial"/>
@@ -1292,7 +1292,7 @@
               </w:rPr>
               <w:t xml:space="preserve">. </w:t>
             </w:r>
-            <w:hyperlink w:history="1" r:id="rIdu3rn5tclgrhh4kx3kapbi">
+            <w:hyperlink w:history="1" r:id="rIdvhr2_pgk47xd7wkgsr_qp">
               <w:r>
                 <w:rPr>
                   <w:rFonts w:ascii="Arial" w:cs="Arial" w:eastAsia="Arial" w:hAnsi="Arial"/>
@@ -1438,7 +1438,7 @@
               </w:rPr>
               <w:t xml:space="preserve">. </w:t>
             </w:r>
-            <w:hyperlink w:history="1" r:id="rIdg2zmecdxy83u7zmnzovhi">
+            <w:hyperlink w:history="1" r:id="rIdbjeqrkmzjbkwolh8pgmx2">
               <w:r>
                 <w:rPr>
                   <w:rFonts w:ascii="Arial" w:cs="Arial" w:eastAsia="Arial" w:hAnsi="Arial"/>
@@ -1458,7 +1458,7 @@
               </w:rPr>
               <w:t xml:space="preserve"> | </w:t>
             </w:r>
-            <w:hyperlink w:history="1" r:id="rIdibsnjvsn0g8sq8-zjebxp">
+            <w:hyperlink w:history="1" r:id="rId462kjjwnvorkmcjrr0whq">
               <w:r>
                 <w:rPr>
                   <w:rFonts w:ascii="Arial" w:cs="Arial" w:eastAsia="Arial" w:hAnsi="Arial"/>
@@ -1604,7 +1604,7 @@
               </w:rPr>
               <w:t xml:space="preserve">. </w:t>
             </w:r>
-            <w:hyperlink w:history="1" r:id="rIdypsyhp9tsxucneiagth65">
+            <w:hyperlink w:history="1" r:id="rId1e2rn8ya-tpksglhc6tup">
               <w:r>
                 <w:rPr>
                   <w:rFonts w:ascii="Arial" w:cs="Arial" w:eastAsia="Arial" w:hAnsi="Arial"/>
@@ -1624,7 +1624,7 @@
               </w:rPr>
               <w:t xml:space="preserve"> | </w:t>
             </w:r>
-            <w:hyperlink w:history="1" r:id="rIdkoqdjq0kaf4ebq1fryn43">
+            <w:hyperlink w:history="1" r:id="rIdv0i0ad2foxsnpwjsvzrco">
               <w:r>
                 <w:rPr>
                   <w:rFonts w:ascii="Arial" w:cs="Arial" w:eastAsia="Arial" w:hAnsi="Arial"/>
@@ -1770,7 +1770,7 @@
               </w:rPr>
               <w:t xml:space="preserve">. </w:t>
             </w:r>
-            <w:hyperlink w:history="1" r:id="rIdkqknpill3mggpkw9qzguo">
+            <w:hyperlink w:history="1" r:id="rId2h02t_lfo_kmhz7u7tosw">
               <w:r>
                 <w:rPr>
                   <w:rFonts w:ascii="Arial" w:cs="Arial" w:eastAsia="Arial" w:hAnsi="Arial"/>
@@ -1790,7 +1790,7 @@
               </w:rPr>
               <w:t xml:space="preserve"> | </w:t>
             </w:r>
-            <w:hyperlink w:history="1" r:id="rIds-nirad9xldgxx29ulqdq">
+            <w:hyperlink w:history="1" r:id="rId7hhuaiwk5jc38wvcqtccw">
               <w:r>
                 <w:rPr>
                   <w:rFonts w:ascii="Arial" w:cs="Arial" w:eastAsia="Arial" w:hAnsi="Arial"/>
@@ -1936,7 +1936,7 @@
               </w:rPr>
               <w:t xml:space="preserve">. </w:t>
             </w:r>
-            <w:hyperlink w:history="1" r:id="rId_t6x7gletdsugxl2gdq9f">
+            <w:hyperlink w:history="1" r:id="rIdij_xallqdpp7odex_cntc">
               <w:r>
                 <w:rPr>
                   <w:rFonts w:ascii="Arial" w:cs="Arial" w:eastAsia="Arial" w:hAnsi="Arial"/>
@@ -1956,7 +1956,7 @@
               </w:rPr>
               <w:t xml:space="preserve"> | </w:t>
             </w:r>
-            <w:hyperlink w:history="1" r:id="rIdguz_havjxcyy-pc-1gho2">
+            <w:hyperlink w:history="1" r:id="rIdbzqqajtjmyoc_xavvf8_c">
               <w:r>
                 <w:rPr>
                   <w:rFonts w:ascii="Arial" w:cs="Arial" w:eastAsia="Arial" w:hAnsi="Arial"/>
@@ -2110,7 +2110,7 @@
               </w:rPr>
               <w:t xml:space="preserve">. </w:t>
             </w:r>
-            <w:hyperlink w:history="1" r:id="rId70jrlsphuehmvist75sf-">
+            <w:hyperlink w:history="1" r:id="rIdz8gnidkhri8xoqxoim9qa">
               <w:r>
                 <w:rPr>
                   <w:rFonts w:ascii="Arial" w:cs="Arial" w:eastAsia="Arial" w:hAnsi="Arial"/>
@@ -2264,7 +2264,7 @@
               </w:rPr>
               <w:t xml:space="preserve">. </w:t>
             </w:r>
-            <w:hyperlink w:history="1" r:id="rIdr2wacw1h57bg6g-ymvj_y">
+            <w:hyperlink w:history="1" r:id="rIdifwjumfxqip-zazl9md9d">
               <w:r>
                 <w:rPr>
                   <w:rFonts w:ascii="Arial" w:cs="Arial" w:eastAsia="Arial" w:hAnsi="Arial"/>
@@ -2830,7 +2830,7 @@
               </w:rPr>
               <w:t xml:space="preserve">. </w:t>
             </w:r>
-            <w:hyperlink w:history="1" r:id="rIdlayes7gmgmgcb6wa4ewx4">
+            <w:hyperlink w:history="1" r:id="rIdvhcudzzo-qej9iv5phovg">
               <w:r>
                 <w:rPr>
                   <w:rFonts w:ascii="Arial" w:cs="Arial" w:eastAsia="Arial" w:hAnsi="Arial"/>
@@ -3001,7 +3001,7 @@
               </w:rPr>
               <w:t xml:space="preserve">. </w:t>
             </w:r>
-            <w:hyperlink w:history="1" r:id="rIdemvsyrbfxasdlrnueitpr">
+            <w:hyperlink w:history="1" r:id="rIdgtvp_jfgozjunscm5ce1m">
               <w:r>
                 <w:rPr>
                   <w:rFonts w:ascii="Arial" w:cs="Arial" w:eastAsia="Arial" w:hAnsi="Arial"/>

</xml_diff>